<commit_message>
Add Quiz 2 (chapter 2) and renumber the later quizzes
Quiz 2 covers the exploratory graphics reading for Lecture 5: log scales,
overplotting, and matching a plot to the data types, plus one callback to
na.rm from the previous reading.

Quizzes are numbered in the order they are given, so the chapter 2 quiz slots in
at 2 and Tidyverse through CodeSharing shift up one.

Co-Authored-By: Claude Opus 5 <noreply@anthropic.com>
</commit_message>
<xml_diff>
--- a/quizzes/Quiz_01_Chapter1.docx
+++ b/quizzes/Quiz_01_Chapter1.docx
@@ -1034,6 +1034,7 @@
     <w:link w:val="VerbatimChar"/>
     <w:pPr>
       <w:wordWrap w:val="off"/>
+      <w:shd w:val="clear" w:fill="f8f8f8"/>
     </w:pPr>
   </w:style>
   <w:style w:type="character" w:customStyle="1" w:styleId="KeywordTok">
@@ -1041,85 +1042,96 @@
     <w:basedOn w:val="VerbatimChar"/>
     <w:rPr>
       <w:b/>
-      <w:color w:val="007020"/>
+      <w:color w:val="204a87"/>
+      <w:shd w:val="clear" w:fill="f8f8f8"/>
     </w:rPr>
   </w:style>
   <w:style w:type="character" w:customStyle="1" w:styleId="DataTypeTok">
     <w:name w:val="DataTypeTok"/>
     <w:basedOn w:val="VerbatimChar"/>
     <w:rPr>
-      <w:color w:val="902000"/>
+      <w:color w:val="204a87"/>
+      <w:shd w:val="clear" w:fill="f8f8f8"/>
     </w:rPr>
   </w:style>
   <w:style w:type="character" w:customStyle="1" w:styleId="DecValTok">
     <w:name w:val="DecValTok"/>
     <w:basedOn w:val="VerbatimChar"/>
     <w:rPr>
-      <w:color w:val="40a070"/>
+      <w:color w:val="0000cf"/>
+      <w:shd w:val="clear" w:fill="f8f8f8"/>
     </w:rPr>
   </w:style>
   <w:style w:type="character" w:customStyle="1" w:styleId="BaseNTok">
     <w:name w:val="BaseNTok"/>
     <w:basedOn w:val="VerbatimChar"/>
     <w:rPr>
-      <w:color w:val="40a070"/>
+      <w:color w:val="0000cf"/>
+      <w:shd w:val="clear" w:fill="f8f8f8"/>
     </w:rPr>
   </w:style>
   <w:style w:type="character" w:customStyle="1" w:styleId="FloatTok">
     <w:name w:val="FloatTok"/>
     <w:basedOn w:val="VerbatimChar"/>
     <w:rPr>
-      <w:color w:val="40a070"/>
+      <w:color w:val="0000cf"/>
+      <w:shd w:val="clear" w:fill="f8f8f8"/>
     </w:rPr>
   </w:style>
   <w:style w:type="character" w:customStyle="1" w:styleId="ConstantTok">
     <w:name w:val="ConstantTok"/>
     <w:basedOn w:val="VerbatimChar"/>
     <w:rPr>
-      <w:color w:val="880000"/>
+      <w:color w:val="8f5902"/>
+      <w:shd w:val="clear" w:fill="f8f8f8"/>
     </w:rPr>
   </w:style>
   <w:style w:type="character" w:customStyle="1" w:styleId="CharTok">
     <w:name w:val="CharTok"/>
     <w:basedOn w:val="VerbatimChar"/>
     <w:rPr>
-      <w:color w:val="4070a0"/>
+      <w:color w:val="4e9a06"/>
+      <w:shd w:val="clear" w:fill="f8f8f8"/>
     </w:rPr>
   </w:style>
   <w:style w:type="character" w:customStyle="1" w:styleId="SpecialCharTok">
     <w:name w:val="SpecialCharTok"/>
     <w:basedOn w:val="VerbatimChar"/>
     <w:rPr>
-      <w:color w:val="4070a0"/>
+      <w:b/>
+      <w:color w:val="ce5c00"/>
+      <w:shd w:val="clear" w:fill="f8f8f8"/>
     </w:rPr>
   </w:style>
   <w:style w:type="character" w:customStyle="1" w:styleId="StringTok">
     <w:name w:val="StringTok"/>
     <w:basedOn w:val="VerbatimChar"/>
     <w:rPr>
-      <w:color w:val="4070a0"/>
+      <w:color w:val="4e9a06"/>
+      <w:shd w:val="clear" w:fill="f8f8f8"/>
     </w:rPr>
   </w:style>
   <w:style w:type="character" w:customStyle="1" w:styleId="VerbatimStringTok">
     <w:name w:val="VerbatimStringTok"/>
     <w:basedOn w:val="VerbatimChar"/>
     <w:rPr>
-      <w:color w:val="4070a0"/>
+      <w:color w:val="4e9a06"/>
+      <w:shd w:val="clear" w:fill="f8f8f8"/>
     </w:rPr>
   </w:style>
   <w:style w:type="character" w:customStyle="1" w:styleId="SpecialStringTok">
     <w:name w:val="SpecialStringTok"/>
     <w:basedOn w:val="VerbatimChar"/>
     <w:rPr>
-      <w:color w:val="bb6688"/>
+      <w:color w:val="4e9a06"/>
+      <w:shd w:val="clear" w:fill="f8f8f8"/>
     </w:rPr>
   </w:style>
   <w:style w:type="character" w:customStyle="1" w:styleId="ImportTok">
     <w:name w:val="ImportTok"/>
     <w:basedOn w:val="VerbatimChar"/>
     <w:rPr>
-      <w:b/>
-      <w:color w:val="008000"/>
+      <w:shd w:val="clear" w:fill="f8f8f8"/>
     </w:rPr>
   </w:style>
   <w:style w:type="character" w:customStyle="1" w:styleId="CommentTok">
@@ -1127,15 +1139,18 @@
     <w:basedOn w:val="VerbatimChar"/>
     <w:rPr>
       <w:i/>
-      <w:color w:val="60a0b0"/>
+      <w:color w:val="8f5902"/>
+      <w:shd w:val="clear" w:fill="f8f8f8"/>
     </w:rPr>
   </w:style>
   <w:style w:type="character" w:customStyle="1" w:styleId="DocumentationTok">
     <w:name w:val="DocumentationTok"/>
     <w:basedOn w:val="VerbatimChar"/>
     <w:rPr>
+      <w:b/>
       <w:i/>
-      <w:color w:val="ba2121"/>
+      <w:color w:val="8f5902"/>
+      <w:shd w:val="clear" w:fill="f8f8f8"/>
     </w:rPr>
   </w:style>
   <w:style w:type="character" w:customStyle="1" w:styleId="AnnotationTok">
@@ -1144,7 +1159,8 @@
     <w:rPr>
       <w:b/>
       <w:i/>
-      <w:color w:val="60a0b0"/>
+      <w:color w:val="8f5902"/>
+      <w:shd w:val="clear" w:fill="f8f8f8"/>
     </w:rPr>
   </w:style>
   <w:style w:type="character" w:customStyle="1" w:styleId="CommentVarTok">
@@ -1153,28 +1169,33 @@
     <w:rPr>
       <w:b/>
       <w:i/>
-      <w:color w:val="60a0b0"/>
+      <w:color w:val="8f5902"/>
+      <w:shd w:val="clear" w:fill="f8f8f8"/>
     </w:rPr>
   </w:style>
   <w:style w:type="character" w:customStyle="1" w:styleId="OtherTok">
     <w:name w:val="OtherTok"/>
     <w:basedOn w:val="VerbatimChar"/>
     <w:rPr>
-      <w:color w:val="007020"/>
+      <w:color w:val="8f5902"/>
+      <w:shd w:val="clear" w:fill="f8f8f8"/>
     </w:rPr>
   </w:style>
   <w:style w:type="character" w:customStyle="1" w:styleId="FunctionTok">
     <w:name w:val="FunctionTok"/>
     <w:basedOn w:val="VerbatimChar"/>
     <w:rPr>
-      <w:color w:val="06287e"/>
+      <w:b/>
+      <w:color w:val="204a87"/>
+      <w:shd w:val="clear" w:fill="f8f8f8"/>
     </w:rPr>
   </w:style>
   <w:style w:type="character" w:customStyle="1" w:styleId="VariableTok">
     <w:name w:val="VariableTok"/>
     <w:basedOn w:val="VerbatimChar"/>
     <w:rPr>
-      <w:color w:val="19177c"/>
+      <w:color w:val="000000"/>
+      <w:shd w:val="clear" w:fill="f8f8f8"/>
     </w:rPr>
   </w:style>
   <w:style w:type="character" w:customStyle="1" w:styleId="ControlFlowTok">
@@ -1182,46 +1203,56 @@
     <w:basedOn w:val="VerbatimChar"/>
     <w:rPr>
       <w:b/>
-      <w:color w:val="007020"/>
+      <w:color w:val="204a87"/>
+      <w:shd w:val="clear" w:fill="f8f8f8"/>
     </w:rPr>
   </w:style>
   <w:style w:type="character" w:customStyle="1" w:styleId="OperatorTok">
     <w:name w:val="OperatorTok"/>
     <w:basedOn w:val="VerbatimChar"/>
     <w:rPr>
-      <w:color w:val="666666"/>
+      <w:b/>
+      <w:color w:val="ce5c00"/>
+      <w:shd w:val="clear" w:fill="f8f8f8"/>
     </w:rPr>
   </w:style>
   <w:style w:type="character" w:customStyle="1" w:styleId="BuiltInTok">
     <w:name w:val="BuiltInTok"/>
     <w:basedOn w:val="VerbatimChar"/>
     <w:rPr>
-      <w:color w:val="008000"/>
+      <w:shd w:val="clear" w:fill="f8f8f8"/>
     </w:rPr>
   </w:style>
   <w:style w:type="character" w:customStyle="1" w:styleId="ExtensionTok">
     <w:name w:val="ExtensionTok"/>
     <w:basedOn w:val="VerbatimChar"/>
-    <w:rPr/>
+    <w:rPr>
+      <w:shd w:val="clear" w:fill="f8f8f8"/>
+    </w:rPr>
   </w:style>
   <w:style w:type="character" w:customStyle="1" w:styleId="PreprocessorTok">
     <w:name w:val="PreprocessorTok"/>
     <w:basedOn w:val="VerbatimChar"/>
     <w:rPr>
-      <w:color w:val="bc7a00"/>
+      <w:i/>
+      <w:color w:val="8f5902"/>
+      <w:shd w:val="clear" w:fill="f8f8f8"/>
     </w:rPr>
   </w:style>
   <w:style w:type="character" w:customStyle="1" w:styleId="AttributeTok">
     <w:name w:val="AttributeTok"/>
     <w:basedOn w:val="VerbatimChar"/>
     <w:rPr>
-      <w:color w:val="7d9029"/>
+      <w:color w:val="204a87"/>
+      <w:shd w:val="clear" w:fill="f8f8f8"/>
     </w:rPr>
   </w:style>
   <w:style w:type="character" w:customStyle="1" w:styleId="RegionMarkerTok">
     <w:name w:val="RegionMarkerTok"/>
     <w:basedOn w:val="VerbatimChar"/>
-    <w:rPr/>
+    <w:rPr>
+      <w:shd w:val="clear" w:fill="f8f8f8"/>
+    </w:rPr>
   </w:style>
   <w:style w:type="character" w:customStyle="1" w:styleId="InformationTok">
     <w:name w:val="InformationTok"/>
@@ -1229,7 +1260,8 @@
     <w:rPr>
       <w:b/>
       <w:i/>
-      <w:color w:val="60a0b0"/>
+      <w:color w:val="8f5902"/>
+      <w:shd w:val="clear" w:fill="f8f8f8"/>
     </w:rPr>
   </w:style>
   <w:style w:type="character" w:customStyle="1" w:styleId="WarningTok">
@@ -1238,15 +1270,16 @@
     <w:rPr>
       <w:b/>
       <w:i/>
-      <w:color w:val="60a0b0"/>
+      <w:color w:val="8f5902"/>
+      <w:shd w:val="clear" w:fill="f8f8f8"/>
     </w:rPr>
   </w:style>
   <w:style w:type="character" w:customStyle="1" w:styleId="AlertTok">
     <w:name w:val="AlertTok"/>
     <w:basedOn w:val="VerbatimChar"/>
     <w:rPr>
-      <w:b/>
-      <w:color w:val="ff0000"/>
+      <w:color w:val="ef2929"/>
+      <w:shd w:val="clear" w:fill="f8f8f8"/>
     </w:rPr>
   </w:style>
   <w:style w:type="character" w:customStyle="1" w:styleId="ErrorTok">
@@ -1254,13 +1287,16 @@
     <w:basedOn w:val="VerbatimChar"/>
     <w:rPr>
       <w:b/>
-      <w:color w:val="ff0000"/>
+      <w:color w:val="a40000"/>
+      <w:shd w:val="clear" w:fill="f8f8f8"/>
     </w:rPr>
   </w:style>
   <w:style w:type="character" w:customStyle="1" w:styleId="NormalTok">
     <w:name w:val="NormalTok"/>
     <w:basedOn w:val="VerbatimChar"/>
-    <w:rPr/>
+    <w:rPr>
+      <w:shd w:val="clear" w:fill="f8f8f8"/>
+    </w:rPr>
   </w:style>
 </w:styles>
 </file>

</xml_diff>